<commit_message>
sync base systeme for cv file
</commit_message>
<xml_diff>
--- a/Hacini_Mohammed_Oussama_CV.docx
+++ b/Hacini_Mohammed_Oussama_CV.docx
@@ -50,7 +50,7 @@
         </w:rPr>
         <w:t xml:space="preserve">Ouargla, Algeria   |   </w:t>
       </w:r>
-      <w:hyperlink w:history="1" r:id="rId5fra-rbtqzbqolvshu3w8">
+      <w:hyperlink w:history="1" r:id="rIdjtxl-dohotb332o78ilv4">
         <w:r>
           <w:rPr>
             <w:rFonts w:ascii="Calibri" w:cs="Calibri" w:eastAsia="Calibri" w:hAnsi="Calibri"/>
@@ -69,7 +69,7 @@
         </w:rPr>
         <w:t xml:space="preserve">   |   </w:t>
       </w:r>
-      <w:hyperlink w:history="1" r:id="rIdfnshaurzhkqe1tvfcjtxi">
+      <w:hyperlink w:history="1" r:id="rIdccyyxkc41_zhv4edha6kl">
         <w:r>
           <w:rPr>
             <w:rFonts w:ascii="Calibri" w:cs="Calibri" w:eastAsia="Calibri" w:hAnsi="Calibri"/>
@@ -88,7 +88,7 @@
         </w:rPr>
         <w:t xml:space="preserve">   |   </w:t>
       </w:r>
-      <w:hyperlink w:history="1" r:id="rIdxzjrr2y4e14_rfwd2hptf">
+      <w:hyperlink w:history="1" r:id="rIdujo7uzievtn2tnikuqsfx">
         <w:r>
           <w:rPr>
             <w:rFonts w:ascii="Calibri" w:cs="Calibri" w:eastAsia="Calibri" w:hAnsi="Calibri"/>

</xml_diff>